<commit_message>
Labs 1-5: lab times updated (Gaurav's feedback, Lab 1 timing)
- Lab 1: "About 95 minutes" (its parts add up to 95)
- Labs 1-5: "New to Kubernetes? Allow up to 2 hours, including time to fix
  small problems" - Gaurav, new to Kubernetes, took about 2 hours per lab
</commit_message>
<xml_diff>
--- a/project-docs/05-student-lab-handouts/DSYS601 Lab3 Install monitoring.docx
+++ b/project-docs/05-student-lab-handouts/DSYS601 Lab3 Install monitoring.docx
@@ -169,13 +169,7 @@
               <w:rPr>
                 <w:lang w:val="en-US"/>
               </w:rPr>
-              <w:t xml:space="preserve">About </w:t>
-            </w:r>
-            <w:r>
-              <w:rPr>
-                <w:lang w:val="en-US"/>
-              </w:rPr>
-              <w:t>90 minutes</w:t>
+              <w:t xml:space="preserve">About 90 minutes. New to Kubernetes? Allow up to 2 hours, including time to fix small problems.</w:t>
             </w:r>
           </w:p>
         </w:tc>

</xml_diff>